<commit_message>
template design and rendering
</commit_message>
<xml_diff>
--- a/instant deployement/Instant deployement.docx
+++ b/instant deployement/Instant deployement.docx
@@ -165,7 +165,15 @@
         </w:rPr>
       </w:pPr>
       <w:r>
-        <w:t xml:space="preserve">Git repo link : </w:t>
+        <w:t xml:space="preserve">Git repo </w:t>
+      </w:r>
+      <w:proofErr w:type="gramStart"/>
+      <w:r>
+        <w:t>link :</w:t>
+      </w:r>
+      <w:proofErr w:type="gramEnd"/>
+      <w:r>
+        <w:t xml:space="preserve"> </w:t>
       </w:r>
       <w:r>
         <w:fldChar w:fldCharType="begin"/>
@@ -396,7 +404,15 @@
         <w:jc w:val="both"/>
       </w:pPr>
       <w:r>
-        <w:t>Device info – Camera make, model, lens</w:t>
+        <w:t xml:space="preserve">Device info – Camera </w:t>
+      </w:r>
+      <w:proofErr w:type="gramStart"/>
+      <w:r>
+        <w:t>make</w:t>
+      </w:r>
+      <w:proofErr w:type="gramEnd"/>
+      <w:r>
+        <w:t>, model, lens</w:t>
       </w:r>
     </w:p>
     <w:p>
@@ -463,7 +479,15 @@
         <w:jc w:val="both"/>
       </w:pPr>
       <w:r>
-        <w:t>GPS Data -  Latitude, Longitude, Altitude, stored as degrees/minutes/seconds, not just a plain decimal</w:t>
+        <w:t xml:space="preserve">GPS Data </w:t>
+      </w:r>
+      <w:proofErr w:type="gramStart"/>
+      <w:r>
+        <w:t>-  Latitude</w:t>
+      </w:r>
+      <w:proofErr w:type="gramEnd"/>
+      <w:r>
+        <w:t>, Longitude, Altitude, stored as degrees/minutes/seconds, not just a plain decimal</w:t>
       </w:r>
     </w:p>
     <w:p>
@@ -531,6 +555,7 @@
         <w:t>/</w:t>
       </w:r>
       <w:proofErr w:type="spellStart"/>
+      <w:proofErr w:type="gramStart"/>
       <w:r>
         <w:rPr>
           <w:i/>
@@ -540,7 +565,11 @@
       </w:r>
       <w:proofErr w:type="spellEnd"/>
       <w:r>
-        <w:t>(feeds reverse geocoding → location names like "Marina Beach, Chennai")</w:t>
+        <w:t>(</w:t>
+      </w:r>
+      <w:proofErr w:type="gramEnd"/>
+      <w:r>
+        <w:t>feeds reverse geocoding → location names like "Marina Beach, Chennai")</w:t>
       </w:r>
     </w:p>
     <w:p>
@@ -1327,7 +1356,15 @@
         <w:jc w:val="both"/>
       </w:pPr>
       <w:r>
-        <w:t xml:space="preserve">Step 2 – Travels over HTTPS to AI’s server(like </w:t>
+        <w:t xml:space="preserve">Step 2 – Travels over HTTPS to AI’s </w:t>
+      </w:r>
+      <w:proofErr w:type="gramStart"/>
+      <w:r>
+        <w:t>server(</w:t>
+      </w:r>
+      <w:proofErr w:type="gramEnd"/>
+      <w:r>
+        <w:t xml:space="preserve">like </w:t>
       </w:r>
       <w:proofErr w:type="spellStart"/>
       <w:r>
@@ -1352,7 +1389,15 @@
         <w:jc w:val="both"/>
       </w:pPr>
       <w:r>
-        <w:t xml:space="preserve">Step 3 – The server checks your key, checks you’re within your rate limit and routed request to the model. </w:t>
+        <w:t xml:space="preserve">Step 3 – The server checks your </w:t>
+      </w:r>
+      <w:proofErr w:type="gramStart"/>
+      <w:r>
+        <w:t>key,</w:t>
+      </w:r>
+      <w:proofErr w:type="gramEnd"/>
+      <w:r>
+        <w:t xml:space="preserve"> checks you’re within your rate limit and routed request to the model. </w:t>
       </w:r>
     </w:p>
     <w:p>
@@ -1916,8 +1961,13 @@
         <w:jc w:val="both"/>
       </w:pPr>
       <w:r>
-        <w:t>Write everything to layer0_fingerprint_output.json</w:t>
-      </w:r>
+        <w:t>Write everything to layer0_fingerprint_</w:t>
+      </w:r>
+      <w:proofErr w:type="gramStart"/>
+      <w:r>
+        <w:t>output.json</w:t>
+      </w:r>
+      <w:proofErr w:type="gramEnd"/>
     </w:p>
     <w:p>
       <w:pPr>
@@ -2115,6 +2165,9 @@
     </w:p>
     <w:p>
       <w:r>
+        <w:rPr>
+          <w:noProof/>
+        </w:rPr>
         <w:drawing>
           <wp:inline distT="0" distB="0" distL="0" distR="0" wp14:anchorId="31F3C2E3" wp14:editId="10F7DF54">
             <wp:extent cx="5731510" cy="4776470"/>
@@ -2692,10 +2745,12 @@
         <w:t xml:space="preserve"> directly as the page's CSS variables, and </w:t>
       </w:r>
       <w:proofErr w:type="spellStart"/>
+      <w:proofErr w:type="gramStart"/>
       <w:r>
         <w:t>roles.primary</w:t>
       </w:r>
       <w:proofErr w:type="spellEnd"/>
+      <w:proofErr w:type="gramEnd"/>
       <w:r>
         <w:t>/accent for headers and borders</w:t>
       </w:r>
@@ -2707,19 +2762,697 @@
         <w:jc w:val="both"/>
       </w:pPr>
       <w:r>
+        <w:t>Writing 5 base layout templates in Json Format</w:t>
+      </w:r>
+      <w:r>
+        <w:t xml:space="preserve"> and Render to HTML</w:t>
+      </w:r>
+    </w:p>
+    <w:p>
+      <w:r>
+        <w:t xml:space="preserve">A blueprint of the design for the code to read. </w:t>
+      </w:r>
+    </w:p>
+    <w:p>
+      <w:pPr>
+        <w:spacing w:after="0"/>
+        <w:rPr>
+          <w:highlight w:val="lightGray"/>
+        </w:rPr>
+      </w:pPr>
+      <w:r>
+        <w:rPr>
+          <w:highlight w:val="lightGray"/>
+        </w:rPr>
+        <w:t xml:space="preserve">Format: </w:t>
+      </w:r>
+    </w:p>
+    <w:p>
+      <w:pPr>
+        <w:spacing w:after="0"/>
+        <w:rPr>
+          <w:highlight w:val="lightGray"/>
+        </w:rPr>
+      </w:pPr>
+      <w:r>
+        <w:rPr>
+          <w:highlight w:val="lightGray"/>
+        </w:rPr>
+        <w:t>PHOTO_TYPES = {"photo", "</w:t>
+      </w:r>
+      <w:proofErr w:type="spellStart"/>
+      <w:r>
+        <w:rPr>
+          <w:highlight w:val="lightGray"/>
+        </w:rPr>
+        <w:t>photo_frame</w:t>
+      </w:r>
+      <w:proofErr w:type="spellEnd"/>
+      <w:r>
+        <w:rPr>
+          <w:highlight w:val="lightGray"/>
+        </w:rPr>
+        <w:t>", "</w:t>
+      </w:r>
+      <w:proofErr w:type="spellStart"/>
+      <w:r>
+        <w:rPr>
+          <w:highlight w:val="lightGray"/>
+        </w:rPr>
+        <w:t>image_placeholder</w:t>
+      </w:r>
+      <w:proofErr w:type="spellEnd"/>
+      <w:r>
+        <w:rPr>
+          <w:highlight w:val="lightGray"/>
+        </w:rPr>
+        <w:t>", "polaroid", "</w:t>
+      </w:r>
+      <w:proofErr w:type="spellStart"/>
+      <w:r>
+        <w:rPr>
+          <w:highlight w:val="lightGray"/>
+        </w:rPr>
+        <w:t>torn_photo</w:t>
+      </w:r>
+      <w:proofErr w:type="spellEnd"/>
+      <w:r>
+        <w:rPr>
+          <w:highlight w:val="lightGray"/>
+        </w:rPr>
+        <w:t>",</w:t>
+      </w:r>
+    </w:p>
+    <w:p>
+      <w:pPr>
+        <w:spacing w:after="0"/>
+        <w:rPr>
+          <w:highlight w:val="lightGray"/>
+        </w:rPr>
+      </w:pPr>
+      <w:r>
+        <w:rPr>
+          <w:highlight w:val="lightGray"/>
+        </w:rPr>
+        <w:t>               "</w:t>
+      </w:r>
+      <w:proofErr w:type="spellStart"/>
+      <w:proofErr w:type="gramStart"/>
+      <w:r>
+        <w:rPr>
+          <w:highlight w:val="lightGray"/>
+        </w:rPr>
+        <w:t>photo</w:t>
+      </w:r>
+      <w:proofErr w:type="gramEnd"/>
+      <w:r>
+        <w:rPr>
+          <w:highlight w:val="lightGray"/>
+        </w:rPr>
+        <w:t>_group</w:t>
+      </w:r>
+      <w:proofErr w:type="spellEnd"/>
+      <w:r>
+        <w:rPr>
+          <w:highlight w:val="lightGray"/>
+        </w:rPr>
+        <w:t>", "</w:t>
+      </w:r>
+      <w:proofErr w:type="spellStart"/>
+      <w:r>
+        <w:rPr>
+          <w:highlight w:val="lightGray"/>
+        </w:rPr>
+        <w:t>film_strip</w:t>
+      </w:r>
+      <w:proofErr w:type="spellEnd"/>
+      <w:r>
+        <w:rPr>
+          <w:highlight w:val="lightGray"/>
+        </w:rPr>
+        <w:t>"}</w:t>
+      </w:r>
+    </w:p>
+    <w:p>
+      <w:pPr>
+        <w:spacing w:after="0"/>
+        <w:rPr>
+          <w:highlight w:val="lightGray"/>
+        </w:rPr>
+      </w:pPr>
+      <w:r>
+        <w:rPr>
+          <w:highlight w:val="lightGray"/>
+        </w:rPr>
+        <w:t>TEXT_TYPES = {"paragraph", "text", "</w:t>
+      </w:r>
+      <w:proofErr w:type="spellStart"/>
+      <w:r>
+        <w:rPr>
+          <w:highlight w:val="lightGray"/>
+        </w:rPr>
+        <w:t>text_area</w:t>
+      </w:r>
+      <w:proofErr w:type="spellEnd"/>
+      <w:r>
+        <w:rPr>
+          <w:highlight w:val="lightGray"/>
+        </w:rPr>
+        <w:t>", "</w:t>
+      </w:r>
+      <w:proofErr w:type="spellStart"/>
+      <w:r>
+        <w:rPr>
+          <w:highlight w:val="lightGray"/>
+        </w:rPr>
+        <w:t>text_label</w:t>
+      </w:r>
+      <w:proofErr w:type="spellEnd"/>
+      <w:r>
+        <w:rPr>
+          <w:highlight w:val="lightGray"/>
+        </w:rPr>
+        <w:t>", "title", "subtitle"}</w:t>
+      </w:r>
+    </w:p>
+    <w:p>
+      <w:pPr>
+        <w:spacing w:after="0"/>
+        <w:rPr>
+          <w:highlight w:val="lightGray"/>
+        </w:rPr>
+      </w:pPr>
+      <w:r>
+        <w:rPr>
+          <w:highlight w:val="lightGray"/>
+        </w:rPr>
         <w:lastRenderedPageBreak/>
-        <w:t>Writing 5 base layout templates in Json Format</w:t>
-      </w:r>
-    </w:p>
-    <w:p>
-      <w:pPr>
-        <w:pStyle w:val="Heading2"/>
-        <w:jc w:val="both"/>
-      </w:pPr>
-      <w:r>
-        <w:t>Render to HTML</w:t>
-      </w:r>
-    </w:p>
+        <w:t>DECOR_TYPES = {"sticker", "doodle", "</w:t>
+      </w:r>
+      <w:proofErr w:type="spellStart"/>
+      <w:r>
+        <w:rPr>
+          <w:highlight w:val="lightGray"/>
+        </w:rPr>
+        <w:t>doodle_placeholder</w:t>
+      </w:r>
+      <w:proofErr w:type="spellEnd"/>
+      <w:r>
+        <w:rPr>
+          <w:highlight w:val="lightGray"/>
+        </w:rPr>
+        <w:t>", "icon", "</w:t>
+      </w:r>
+      <w:proofErr w:type="spellStart"/>
+      <w:r>
+        <w:rPr>
+          <w:highlight w:val="lightGray"/>
+        </w:rPr>
+        <w:t>vector_graphic</w:t>
+      </w:r>
+      <w:proofErr w:type="spellEnd"/>
+      <w:r>
+        <w:rPr>
+          <w:highlight w:val="lightGray"/>
+        </w:rPr>
+        <w:t>",</w:t>
+      </w:r>
+    </w:p>
+    <w:p>
+      <w:pPr>
+        <w:spacing w:after="0"/>
+        <w:rPr>
+          <w:highlight w:val="lightGray"/>
+        </w:rPr>
+      </w:pPr>
+      <w:r>
+        <w:rPr>
+          <w:highlight w:val="lightGray"/>
+        </w:rPr>
+        <w:t>                "</w:t>
+      </w:r>
+      <w:proofErr w:type="spellStart"/>
+      <w:proofErr w:type="gramStart"/>
+      <w:r>
+        <w:rPr>
+          <w:highlight w:val="lightGray"/>
+        </w:rPr>
+        <w:t>graphic</w:t>
+      </w:r>
+      <w:proofErr w:type="gramEnd"/>
+      <w:r>
+        <w:rPr>
+          <w:highlight w:val="lightGray"/>
+        </w:rPr>
+        <w:t>_element</w:t>
+      </w:r>
+      <w:proofErr w:type="spellEnd"/>
+      <w:r>
+        <w:rPr>
+          <w:highlight w:val="lightGray"/>
+        </w:rPr>
+        <w:t>", "</w:t>
+      </w:r>
+      <w:proofErr w:type="spellStart"/>
+      <w:r>
+        <w:rPr>
+          <w:highlight w:val="lightGray"/>
+        </w:rPr>
+        <w:t>ui_element</w:t>
+      </w:r>
+      <w:proofErr w:type="spellEnd"/>
+      <w:r>
+        <w:rPr>
+          <w:highlight w:val="lightGray"/>
+        </w:rPr>
+        <w:t>"}</w:t>
+      </w:r>
+    </w:p>
+    <w:p>
+      <w:pPr>
+        <w:spacing w:after="0"/>
+        <w:rPr>
+          <w:highlight w:val="lightGray"/>
+        </w:rPr>
+      </w:pPr>
+      <w:r>
+        <w:rPr>
+          <w:highlight w:val="lightGray"/>
+        </w:rPr>
+        <w:t>PERSON_TYPES = {"</w:t>
+      </w:r>
+      <w:proofErr w:type="spellStart"/>
+      <w:r>
+        <w:rPr>
+          <w:highlight w:val="lightGray"/>
+        </w:rPr>
+        <w:t>person_cutout</w:t>
+      </w:r>
+      <w:proofErr w:type="spellEnd"/>
+      <w:r>
+        <w:rPr>
+          <w:highlight w:val="lightGray"/>
+        </w:rPr>
+        <w:t>"}</w:t>
+      </w:r>
+    </w:p>
+    <w:p>
+      <w:pPr>
+        <w:spacing w:after="0"/>
+        <w:rPr>
+          <w:highlight w:val="lightGray"/>
+        </w:rPr>
+      </w:pPr>
+      <w:r>
+        <w:rPr>
+          <w:highlight w:val="lightGray"/>
+        </w:rPr>
+        <w:t>GROUP_TYPES = {"</w:t>
+      </w:r>
+      <w:proofErr w:type="spellStart"/>
+      <w:r>
+        <w:rPr>
+          <w:highlight w:val="lightGray"/>
+        </w:rPr>
+        <w:t>composite_group</w:t>
+      </w:r>
+      <w:proofErr w:type="spellEnd"/>
+      <w:r>
+        <w:rPr>
+          <w:highlight w:val="lightGray"/>
+        </w:rPr>
+        <w:t>"}</w:t>
+      </w:r>
+    </w:p>
+    <w:p>
+      <w:pPr>
+        <w:spacing w:after="0"/>
+        <w:rPr>
+          <w:highlight w:val="lightGray"/>
+        </w:rPr>
+      </w:pPr>
+      <w:r>
+        <w:rPr>
+          <w:highlight w:val="lightGray"/>
+        </w:rPr>
+        <w:t>MUSIC_TYPES = {"</w:t>
+      </w:r>
+      <w:proofErr w:type="spellStart"/>
+      <w:r>
+        <w:rPr>
+          <w:highlight w:val="lightGray"/>
+        </w:rPr>
+        <w:t>music_card</w:t>
+      </w:r>
+      <w:proofErr w:type="spellEnd"/>
+      <w:r>
+        <w:rPr>
+          <w:highlight w:val="lightGray"/>
+        </w:rPr>
+        <w:t>", "</w:t>
+      </w:r>
+      <w:proofErr w:type="spellStart"/>
+      <w:r>
+        <w:rPr>
+          <w:highlight w:val="lightGray"/>
+        </w:rPr>
+        <w:t>song_cover</w:t>
+      </w:r>
+      <w:proofErr w:type="spellEnd"/>
+      <w:r>
+        <w:rPr>
+          <w:highlight w:val="lightGray"/>
+        </w:rPr>
+        <w:t>"}</w:t>
+      </w:r>
+    </w:p>
+    <w:p>
+      <w:pPr>
+        <w:spacing w:after="0"/>
+        <w:rPr>
+          <w:highlight w:val="lightGray"/>
+        </w:rPr>
+      </w:pPr>
+      <w:r>
+        <w:rPr>
+          <w:highlight w:val="lightGray"/>
+        </w:rPr>
+        <w:t>SHAPE_TYPES = {"shape"}</w:t>
+      </w:r>
+    </w:p>
+    <w:p>
+      <w:pPr>
+        <w:spacing w:after="0"/>
+        <w:rPr>
+          <w:highlight w:val="lightGray"/>
+        </w:rPr>
+      </w:pPr>
+    </w:p>
+    <w:p>
+      <w:pPr>
+        <w:spacing w:after="0"/>
+        <w:rPr>
+          <w:highlight w:val="lightGray"/>
+        </w:rPr>
+      </w:pPr>
+      <w:r>
+        <w:rPr>
+          <w:highlight w:val="lightGray"/>
+        </w:rPr>
+        <w:t>ANCHOR_RULES = {</w:t>
+      </w:r>
+    </w:p>
+    <w:p>
+      <w:pPr>
+        <w:spacing w:after="0"/>
+        <w:rPr>
+          <w:highlight w:val="lightGray"/>
+        </w:rPr>
+      </w:pPr>
+      <w:r>
+        <w:rPr>
+          <w:highlight w:val="lightGray"/>
+        </w:rPr>
+        <w:t>    "</w:t>
+      </w:r>
+      <w:proofErr w:type="spellStart"/>
+      <w:proofErr w:type="gramStart"/>
+      <w:r>
+        <w:rPr>
+          <w:highlight w:val="lightGray"/>
+        </w:rPr>
+        <w:t>top</w:t>
+      </w:r>
+      <w:proofErr w:type="gramEnd"/>
+      <w:r>
+        <w:rPr>
+          <w:highlight w:val="lightGray"/>
+        </w:rPr>
+        <w:t>_center</w:t>
+      </w:r>
+      <w:proofErr w:type="spellEnd"/>
+      <w:r>
+        <w:rPr>
+          <w:highlight w:val="lightGray"/>
+        </w:rPr>
+        <w:t>": {"top": "-6%", "left": "50%", "transform": "</w:t>
+      </w:r>
+      <w:proofErr w:type="spellStart"/>
+      <w:proofErr w:type="gramStart"/>
+      <w:r>
+        <w:rPr>
+          <w:highlight w:val="lightGray"/>
+        </w:rPr>
+        <w:t>translateX</w:t>
+      </w:r>
+      <w:proofErr w:type="spellEnd"/>
+      <w:r>
+        <w:rPr>
+          <w:highlight w:val="lightGray"/>
+        </w:rPr>
+        <w:t>(</w:t>
+      </w:r>
+      <w:proofErr w:type="gramEnd"/>
+      <w:r>
+        <w:rPr>
+          <w:highlight w:val="lightGray"/>
+        </w:rPr>
+        <w:t>-50%)"},</w:t>
+      </w:r>
+    </w:p>
+    <w:p>
+      <w:pPr>
+        <w:spacing w:after="0"/>
+        <w:rPr>
+          <w:highlight w:val="lightGray"/>
+        </w:rPr>
+      </w:pPr>
+      <w:r>
+        <w:rPr>
+          <w:highlight w:val="lightGray"/>
+        </w:rPr>
+        <w:t>    "</w:t>
+      </w:r>
+      <w:proofErr w:type="spellStart"/>
+      <w:proofErr w:type="gramStart"/>
+      <w:r>
+        <w:rPr>
+          <w:highlight w:val="lightGray"/>
+        </w:rPr>
+        <w:t>bottom</w:t>
+      </w:r>
+      <w:proofErr w:type="gramEnd"/>
+      <w:r>
+        <w:rPr>
+          <w:highlight w:val="lightGray"/>
+        </w:rPr>
+        <w:t>_center</w:t>
+      </w:r>
+      <w:proofErr w:type="spellEnd"/>
+      <w:r>
+        <w:rPr>
+          <w:highlight w:val="lightGray"/>
+        </w:rPr>
+        <w:t>": {"bottom": "-6%", "left": "50%", "transform": "</w:t>
+      </w:r>
+      <w:proofErr w:type="spellStart"/>
+      <w:proofErr w:type="gramStart"/>
+      <w:r>
+        <w:rPr>
+          <w:highlight w:val="lightGray"/>
+        </w:rPr>
+        <w:t>translateX</w:t>
+      </w:r>
+      <w:proofErr w:type="spellEnd"/>
+      <w:r>
+        <w:rPr>
+          <w:highlight w:val="lightGray"/>
+        </w:rPr>
+        <w:t>(</w:t>
+      </w:r>
+      <w:proofErr w:type="gramEnd"/>
+      <w:r>
+        <w:rPr>
+          <w:highlight w:val="lightGray"/>
+        </w:rPr>
+        <w:t>-50%)"},</w:t>
+      </w:r>
+    </w:p>
+    <w:p>
+      <w:pPr>
+        <w:spacing w:after="0"/>
+        <w:rPr>
+          <w:highlight w:val="lightGray"/>
+        </w:rPr>
+      </w:pPr>
+      <w:r>
+        <w:rPr>
+          <w:highlight w:val="lightGray"/>
+        </w:rPr>
+        <w:t>    "</w:t>
+      </w:r>
+      <w:proofErr w:type="spellStart"/>
+      <w:proofErr w:type="gramStart"/>
+      <w:r>
+        <w:rPr>
+          <w:highlight w:val="lightGray"/>
+        </w:rPr>
+        <w:t>top</w:t>
+      </w:r>
+      <w:proofErr w:type="gramEnd"/>
+      <w:r>
+        <w:rPr>
+          <w:highlight w:val="lightGray"/>
+        </w:rPr>
+        <w:t>_right</w:t>
+      </w:r>
+      <w:proofErr w:type="spellEnd"/>
+      <w:r>
+        <w:rPr>
+          <w:highlight w:val="lightGray"/>
+        </w:rPr>
+        <w:t>": {"top": "-6%", "right": "-6%"},</w:t>
+      </w:r>
+    </w:p>
+    <w:p>
+      <w:pPr>
+        <w:spacing w:after="0"/>
+        <w:rPr>
+          <w:highlight w:val="lightGray"/>
+        </w:rPr>
+      </w:pPr>
+      <w:r>
+        <w:rPr>
+          <w:highlight w:val="lightGray"/>
+        </w:rPr>
+        <w:t>    "</w:t>
+      </w:r>
+      <w:proofErr w:type="spellStart"/>
+      <w:proofErr w:type="gramStart"/>
+      <w:r>
+        <w:rPr>
+          <w:highlight w:val="lightGray"/>
+        </w:rPr>
+        <w:t>top</w:t>
+      </w:r>
+      <w:proofErr w:type="gramEnd"/>
+      <w:r>
+        <w:rPr>
+          <w:highlight w:val="lightGray"/>
+        </w:rPr>
+        <w:t>_left</w:t>
+      </w:r>
+      <w:proofErr w:type="spellEnd"/>
+      <w:r>
+        <w:rPr>
+          <w:highlight w:val="lightGray"/>
+        </w:rPr>
+        <w:t>": {"top": "-6%", "left": "-6%"},</w:t>
+      </w:r>
+    </w:p>
+    <w:p>
+      <w:pPr>
+        <w:spacing w:after="0"/>
+        <w:rPr>
+          <w:highlight w:val="lightGray"/>
+        </w:rPr>
+      </w:pPr>
+      <w:r>
+        <w:rPr>
+          <w:highlight w:val="lightGray"/>
+        </w:rPr>
+        <w:t>    "</w:t>
+      </w:r>
+      <w:proofErr w:type="spellStart"/>
+      <w:proofErr w:type="gramStart"/>
+      <w:r>
+        <w:rPr>
+          <w:highlight w:val="lightGray"/>
+        </w:rPr>
+        <w:t>bottom</w:t>
+      </w:r>
+      <w:proofErr w:type="gramEnd"/>
+      <w:r>
+        <w:rPr>
+          <w:highlight w:val="lightGray"/>
+        </w:rPr>
+        <w:t>_right</w:t>
+      </w:r>
+      <w:proofErr w:type="spellEnd"/>
+      <w:r>
+        <w:rPr>
+          <w:highlight w:val="lightGray"/>
+        </w:rPr>
+        <w:t>": {"bottom": "-6%", "right": "-6%"},</w:t>
+      </w:r>
+    </w:p>
+    <w:p>
+      <w:pPr>
+        <w:spacing w:after="0"/>
+      </w:pPr>
+      <w:r>
+        <w:rPr>
+          <w:highlight w:val="lightGray"/>
+        </w:rPr>
+        <w:t>    "</w:t>
+      </w:r>
+      <w:proofErr w:type="spellStart"/>
+      <w:proofErr w:type="gramStart"/>
+      <w:r>
+        <w:rPr>
+          <w:highlight w:val="lightGray"/>
+        </w:rPr>
+        <w:t>bottom</w:t>
+      </w:r>
+      <w:proofErr w:type="gramEnd"/>
+      <w:r>
+        <w:rPr>
+          <w:highlight w:val="lightGray"/>
+        </w:rPr>
+        <w:t>_left</w:t>
+      </w:r>
+      <w:proofErr w:type="spellEnd"/>
+      <w:r>
+        <w:rPr>
+          <w:highlight w:val="lightGray"/>
+        </w:rPr>
+        <w:t>": {"bottom": "-6%", "left": "-6%"},</w:t>
+      </w:r>
+    </w:p>
+    <w:p>
+      <w:r>
+        <w:t>}</w:t>
+      </w:r>
+    </w:p>
+    <w:p>
+      <w:pPr>
+        <w:pStyle w:val="Heading3"/>
+      </w:pPr>
+      <w:r>
+        <w:t>Rendering in HTML</w:t>
+      </w:r>
+    </w:p>
+    <w:p>
+      <w:r>
+        <w:t xml:space="preserve">Turning the blueprint into something to be visualized. </w:t>
+      </w:r>
+      <w:r>
+        <w:t xml:space="preserve">Rendering to HTML means: write a small program that reads one of those JSON </w:t>
+      </w:r>
+      <w:proofErr w:type="gramStart"/>
+      <w:r>
+        <w:t>zone</w:t>
+      </w:r>
+      <w:proofErr w:type="gramEnd"/>
+      <w:r>
+        <w:t xml:space="preserve"> lists and generates real &lt;div&gt; elements, each positioned at the JSON's x/y/w/h using CSS Grid</w:t>
+      </w:r>
+      <w:r>
+        <w:t>.</w:t>
+      </w:r>
+    </w:p>
+    <w:p/>
+    <w:p/>
     <w:p>
       <w:pPr>
         <w:pStyle w:val="Heading2"/>

</xml_diff>